<commit_message>
feat: i18n PT/EN, catálogo ASVS 5.0, UX admin e erros tRPC localizados
</commit_message>
<xml_diff>
--- a/secureforgeweb_web/docs/SBSEG2026_SecureForge_Web.docx
+++ b/secureforgeweb_web/docs/SBSEG2026_SecureForge_Web.docx
@@ -149,13 +149,7 @@
         <w:jc w:val="both"/>
       </w:pPr>
       <w:r>
-        <w:rPr>
-          <w:rFonts w:ascii="Times New Roman" w:hAnsi="Times New Roman"/>
-          <w:b w:val="0"/>
-          <w:i/>
-          <w:sz w:val="24"/>
-        </w:rPr>
-        <w:t>¹https://github.com/margefson/secureforgeweb</w:t>
+        <w:t>¹https://github.com/secureforgeweb/secureforgeweb</w:t>
       </w:r>
     </w:p>
     <w:p>
@@ -163,10 +157,77 @@
         <w:pStyle w:val="Heading1"/>
       </w:pPr>
       <w:r>
-        <w:rPr>
-          <w:rFonts w:ascii="Times New Roman" w:hAnsi="Times New Roman"/>
-        </w:rPr>
-        <w:t>2. Arquitetura da SecureForge Web</w:t>
+        <w:t>2. Trabalhos Relacionados</w:t>
+      </w:r>
+    </w:p>
+    <w:p>
+      <w:pPr/>
+      <w:r>
+        <w:t>A literatura sobre segurança de aplicações web abrange desde padrões normativos e metodologias de teste até plataformas automatizadas de varredura e modelos quantitativos de postura. Esta seção posiciona a SecureForge Web em relação a esses trabalhos, destacando convergências e lacunas que motivam a proposta apresentada.</w:t>
+      </w:r>
+    </w:p>
+    <w:p>
+      <w:pPr>
+        <w:pStyle w:val="Heading2"/>
+      </w:pPr>
+      <w:r>
+        <w:t>2.1. Padrões OWASP e checklists de hardening</w:t>
+      </w:r>
+    </w:p>
+    <w:p>
+      <w:pPr/>
+      <w:r>
+        <w:t>O OWASP Application Security Verification Standard (ASVS) [2] estabelece requisitos técnicos verificáveis para aplicações web, enquanto o Web Security Testing Guide (WSTG) [3] orienta testes de segurança de forma metodológica. O Developer Guide da OWASP consolida checklists por domínio (autenticação, sessão, controle de acesso, validação de entrada, criptografia e configuração). Trabalhos como o de CIS [11] demonstram que diretrizes OWASP podem ser aplicadas ao longo do ciclo de desenvolvimento como checklist, com validação posterior por auditoria de código e testes de penetração. Esses artefatos definem o que verificar, mas não oferecem, por si só, um fluxo operacional integrado de cadastro de aplicações, wizard guiado, gestão de achados e relatório consolidado — lacuna que a SecureForge Web endereça.</w:t>
+      </w:r>
+    </w:p>
+    <w:p>
+      <w:pPr>
+        <w:pStyle w:val="Heading2"/>
+      </w:pPr>
+      <w:r>
+        <w:t>2.2. Avaliação quantitativa baseada em ASVS</w:t>
+      </w:r>
+    </w:p>
+    <w:p>
+      <w:pPr/>
+      <w:r>
+        <w:t>Wen e Katt [12] propõem modelo quantitativo de avaliação de segurança web fundamentado no ASVS, expressando o nível de segurança por métricas computacionais e análise de pontos fortes e fracos. Revniuk et al. [13] descrevem sistema de informação para avaliação quantitativa ASVS com pesos de especialistas, lógica fuzzy e visualização de resultados — arquiteturalmente próximo ao dashboard de postura da SecureForge Web. Em linha semelhante, estudos sobre métricas de security assurance [14] discutem como transformar conformidade qualitativa em indicadores mensuráveis. A diferença central da proposta aqui apresentada é combinar score de postura com automação assistida (HTTP, Git e IA) e validação humana explícita no wizard, em vez de depender exclusivamente de julgamento de especialistas ou de modelos puramente estáticos.</w:t>
+      </w:r>
+    </w:p>
+    <w:p>
+      <w:pPr>
+        <w:pStyle w:val="Heading2"/>
+      </w:pPr>
+      <w:r>
+        <w:t>2.3. Automação, DAST e ferramentas de hardening</w:t>
+      </w:r>
+    </w:p>
+    <w:p>
+      <w:pPr/>
+      <w:r>
+        <w:t>Ferramentas de Dynamic Application Security Testing (DAST), como o OWASP ZAP, automatizam a descoberta de vulnerabilidades em escala [15], porém tendem a produzir alto volume de alertas e exigem triagem especializada. Estudos em pipelines CI/CD [10] mapeiam verificações de segurança contínuas, enquanto trabalhos sobre operationalização do ASVS em CI/CD [16] buscam testes reproduzíveis em ambientes industriais. No domínio de headers HTTP, ferramentas especializadas (ex.: analisadores de HSTS, CSP e políticas de origem cruzada) oferecem verificação pontual e integração a pipelines. Projetos open source recentes — como frameworks de avaliação black-box com nota A–F e relatório PDF [17] ou plataformas de hardening com mapeamento OWASP Top 10 [18] — aproximam-se da automação parcial, mas não integram checklist guiado por item, evidências rastreáveis por resposta, assistente de IA configurável por usuário e benchmark administrativo entre operadores.</w:t>
+      </w:r>
+    </w:p>
+    <w:p>
+      <w:pPr>
+        <w:pStyle w:val="Heading2"/>
+      </w:pPr>
+      <w:r>
+        <w:t>2.4. Maturidade de processo e posicionamento da SecureForge Web</w:t>
+      </w:r>
+    </w:p>
+    <w:p>
+      <w:pPr/>
+      <w:r>
+        <w:t>Modelos de maturidade como o OWASP SAMM [19] e o BSIMM [20] avaliam a capacidade organizacional de segurança de software, não o hardening pontual de uma aplicação específica. A SecureForge Web ocupa nicho complementar: ferramenta operacional para equipes pequenas, laboratórios e projetos acadêmicos que necessitam de processo estruturado de revisão AppSec sem scanner enterprise. Em síntese, o trabalho se diferencia por unir (i) checklist OWASP guiado com 24 itens em nove categorias; (ii) três escopos de automação assistida com revisão humana obrigatória; (iii) persistência de evidências auditáveis; (iv) dashboard e exportação PDF; (v) configuração de IA por perfil e comparação administrativa entre análises — combinação não encontrada de forma integrada nos trabalhos relacionados revisados.</w:t>
+      </w:r>
+    </w:p>
+    <w:p>
+      <w:pPr>
+        <w:pStyle w:val="Heading1"/>
+      </w:pPr>
+      <w:r>
+        <w:t>3. Arquitetura da SecureForge Web</w:t>
       </w:r>
     </w:p>
     <w:p>
@@ -216,10 +277,7 @@
         <w:pStyle w:val="Heading2"/>
       </w:pPr>
       <w:r>
-        <w:rPr>
-          <w:rFonts w:ascii="Times New Roman" w:hAnsi="Times New Roman"/>
-        </w:rPr>
-        <w:t>2.1. Gestão de Aplicações e Análises</w:t>
+        <w:t>3.1. Gestão de Aplicações e Análises</w:t>
       </w:r>
     </w:p>
     <w:p>
@@ -241,10 +299,7 @@
         <w:pStyle w:val="Heading2"/>
       </w:pPr>
       <w:r>
-        <w:rPr>
-          <w:rFonts w:ascii="Times New Roman" w:hAnsi="Times New Roman"/>
-        </w:rPr>
-        <w:t>2.2. Assessor HTTP (Headers de Segurança)</w:t>
+        <w:t>3.2. Assessor HTTP (Headers de Segurança)</w:t>
       </w:r>
     </w:p>
     <w:p>
@@ -280,10 +335,7 @@
         <w:pStyle w:val="Heading2"/>
       </w:pPr>
       <w:r>
-        <w:rPr>
-          <w:rFonts w:ascii="Times New Roman" w:hAnsi="Times New Roman"/>
-        </w:rPr>
-        <w:t>2.3. Assessor Git (Análise Estática de Repositório)</w:t>
+        <w:t>3.3. Assessor Git (Análise Estática de Repositório)</w:t>
       </w:r>
     </w:p>
     <w:p>
@@ -319,10 +371,7 @@
         <w:pStyle w:val="Heading2"/>
       </w:pPr>
       <w:r>
-        <w:rPr>
-          <w:rFonts w:ascii="Times New Roman" w:hAnsi="Times New Roman"/>
-        </w:rPr>
-        <w:t>2.4. Assistente IA por Usuário</w:t>
+        <w:t>3.4. Assistente IA por Usuário</w:t>
       </w:r>
     </w:p>
     <w:p>
@@ -358,10 +407,7 @@
         <w:pStyle w:val="Heading2"/>
       </w:pPr>
       <w:r>
-        <w:rPr>
-          <w:rFonts w:ascii="Times New Roman" w:hAnsi="Times New Roman"/>
-        </w:rPr>
-        <w:t>2.5. Evidências e Rastreabilidade</w:t>
+        <w:t>3.5. Evidências e Rastreabilidade</w:t>
       </w:r>
     </w:p>
     <w:p>
@@ -397,10 +443,7 @@
         <w:pStyle w:val="Heading2"/>
       </w:pPr>
       <w:r>
-        <w:rPr>
-          <w:rFonts w:ascii="Times New Roman" w:hAnsi="Times New Roman"/>
-        </w:rPr>
-        <w:t>2.6. Achados, Postura e Governança Administrativa</w:t>
+        <w:t>3.6. Achados, Postura e Governança Administrativa</w:t>
       </w:r>
     </w:p>
     <w:p>
@@ -422,10 +465,7 @@
         <w:pStyle w:val="Heading1"/>
       </w:pPr>
       <w:r>
-        <w:rPr>
-          <w:rFonts w:ascii="Times New Roman" w:hAnsi="Times New Roman"/>
-        </w:rPr>
-        <w:t>3. Limitações</w:t>
+        <w:t>4. Limitações</w:t>
       </w:r>
     </w:p>
     <w:p>
@@ -447,10 +487,7 @@
         <w:pStyle w:val="Heading1"/>
       </w:pPr>
       <w:r>
-        <w:rPr>
-          <w:rFonts w:ascii="Times New Roman" w:hAnsi="Times New Roman"/>
-        </w:rPr>
-        <w:t>4. Avaliação Experimental</w:t>
+        <w:t>5. Avaliação Experimental</w:t>
       </w:r>
     </w:p>
     <w:p>
@@ -458,10 +495,7 @@
         <w:pStyle w:val="Heading2"/>
       </w:pPr>
       <w:r>
-        <w:rPr>
-          <w:rFonts w:ascii="Times New Roman" w:hAnsi="Times New Roman"/>
-        </w:rPr>
-        <w:t>4.1. Ambiente e Metodologia</w:t>
+        <w:t>5.1. Ambiente e Metodologia</w:t>
       </w:r>
     </w:p>
     <w:p>
@@ -469,12 +503,6 @@
         <w:jc w:val="both"/>
       </w:pPr>
       <w:r>
-        <w:rPr>
-          <w:rFonts w:ascii="Times New Roman" w:hAnsi="Times New Roman"/>
-          <w:b w:val="0"/>
-          <w:i w:val="0"/>
-          <w:sz w:val="24"/>
-        </w:rPr>
         <w:t>A avaliação foi conduzida sobre a própria aplicação SecureForge Web em ambiente de desenvolvimento local, com PostgreSQL 16 em contêiner Docker, Node.js 20+ e pnpm como gerenciador de pacotes. A máquina hospedeira dispõe de processador Intel Core i7, 16 GB de RAM e SSD. O repositório público github.com/margefson/secureforgeweb foi cadastrado como alvo, com URL base http://localhost:5173 para avaliação HTTP.</w:t>
       </w:r>
     </w:p>
@@ -497,10 +525,7 @@
         <w:pStyle w:val="Heading2"/>
       </w:pPr>
       <w:r>
-        <w:rPr>
-          <w:rFonts w:ascii="Times New Roman" w:hAnsi="Times New Roman"/>
-        </w:rPr>
-        <w:t>4.2. Resultados</w:t>
+        <w:t>5.2. Resultados</w:t>
       </w:r>
     </w:p>
     <w:p>
@@ -988,10 +1013,7 @@
         <w:pStyle w:val="Heading1"/>
       </w:pPr>
       <w:r>
-        <w:rPr>
-          <w:rFonts w:ascii="Times New Roman" w:hAnsi="Times New Roman"/>
-        </w:rPr>
-        <w:t>5. Conclusão</w:t>
+        <w:t>6. Conclusão</w:t>
       </w:r>
     </w:p>
     <w:p>
@@ -1041,10 +1063,7 @@
         <w:pStyle w:val="Heading1"/>
       </w:pPr>
       <w:r>
-        <w:rPr>
-          <w:rFonts w:ascii="Times New Roman" w:hAnsi="Times New Roman"/>
-        </w:rPr>
-        <w:t>6. Agradecimentos</w:t>
+        <w:t>7. Agradecimentos</w:t>
       </w:r>
     </w:p>
     <w:p>
@@ -1193,6 +1212,66 @@
       </w:r>
     </w:p>
     <w:p/>
+    <w:p>
+      <w:pPr/>
+      <w:r>
+        <w:t>CIS (2013). Developing a Secure Web Application Using OWASP Guidelines. Computer and Information Science, 2(4), 137–148. https://doi.org/10.5539/cis.v2n4p137. Acessado em: 07-07-2026.</w:t>
+      </w:r>
+    </w:p>
+    <w:p>
+      <w:pPr/>
+      <w:r>
+        <w:t>Wen, S.-F. and Katt, B. (2023). A quantitative security evaluation and analysis model for web applications based on OWASP application security verification standard. Computers &amp; Security, 135, 103532. https://doi.org/10.1016/j.cose.2023.103532. Acessado em: 07-07-2026.</w:t>
+      </w:r>
+    </w:p>
+    <w:p>
+      <w:pPr/>
+      <w:r>
+        <w:t>Revniuk, O. et al. (2025). Development of an information system for the quantitative assessment of web application security based on the OWASP ASVS standard. Scientific Journal of the Ternopil Ivan Puluj National Technical University, 118(2), 56–65. https://sj.tntu.edu.ua/index.php/sjtntu/article/view/63. Acessado em: 07-07-2026.</w:t>
+      </w:r>
+    </w:p>
+    <w:p>
+      <w:pPr/>
+      <w:r>
+        <w:t>Wen, S.-F. et al. (2022). Developing Security Assurance Metrics to Support Quantitative Security Assurance Evaluation. Journal of Cybersecurity and Privacy, 2(3), 587–605. https://doi.org/10.3390/jcp2030030. Acessado em: 07-07-2026.</w:t>
+      </w:r>
+    </w:p>
+    <w:p>
+      <w:pPr/>
+      <w:r>
+        <w:t>Priyawati, D. et al. (2022). Website Vulnerability Testing and Analysis of Website Application Using OWASP. International Journal of Computer and Information System (IJCIS), 3(3), 142–147. https://doi.org/10.29040/ijcis.v3i3.90. Acessado em: 07-07-2026.</w:t>
+      </w:r>
+    </w:p>
+    <w:p>
+      <w:pPr/>
+      <w:r>
+        <w:t>Operationalizing OWASP ASVS Level 1 in CI/CD (2024). Master's thesis, Tampere University. https://trepo.tuni.fi/handle/10024/233001. Acessado em: 07-07-2026.</w:t>
+      </w:r>
+    </w:p>
+    <w:p>
+      <w:pPr/>
+      <w:r>
+        <w:t>SHIELD Framework (2024). Dual-mode black-box security assessment framework. https://github.com/Georges034302/SHIELD-framework. Acessado em: 07-07-2026.</w:t>
+      </w:r>
+    </w:p>
+    <w:p>
+      <w:pPr/>
+      <w:r>
+        <w:t>StackSentry (2024). Automated web application security assessment framework. https://github.com/vickkykruz/sec_audit_framework. Acessado em: 07-07-2026.</w:t>
+      </w:r>
+    </w:p>
+    <w:p>
+      <w:pPr/>
+      <w:r>
+        <w:t>OWASP Foundation (2024). OWASP Software Assurance Maturity Model (SAMM). https://owasp.org/www-project-samm/. Acessado em: 07-07-2026.</w:t>
+      </w:r>
+    </w:p>
+    <w:p>
+      <w:pPr/>
+      <w:r>
+        <w:t>Synopsys (2024). Building Security In Maturity Model (BSIMM). https://www.synopsys.com/software-integrity/software-security-services/bsimm.html. Acessado em: 07-07-2026.</w:t>
+      </w:r>
+    </w:p>
     <w:p>
       <w:pPr>
         <w:jc w:val="center"/>

</xml_diff>